<commit_message>
Fix DOC-3 date field: remove extra trailing 日 character
Co-Authored-By: Claude Opus 4.6 <noreply@anthropic.com>
</commit_message>
<xml_diff>
--- a/public/templates/DOC-3.docx
+++ b/public/templates/DOC-3.docx
@@ -572,14 +572,6 @@
                 <w:szCs w:val="28"/>
               </w:rPr>
               <w:t>{signing_date_roc}</w:t>
-            </w:r>
-            <w:r>
-              <w:rPr>
-                <w:rFonts w:ascii="DFKai-SB" w:eastAsia="DFKai-SB" w:hAnsi="DFKai-SB"/>
-                <w:sz w:val="28"/>
-                <w:szCs w:val="28"/>
-              </w:rPr>
-              <w:t>日</w:t>
             </w:r>
           </w:p>
         </w:tc>

</xml_diff>